<commit_message>
Report Task 3+4: correzioni commenti Alessia (parametri EvoMine, nota probabilità condizionale MTM)
</commit_message>
<xml_diff>
--- a/lab/task_3/report_task3_completo.docx
+++ b/lab/task_3/report_task3_completo.docx
@@ -372,59 +372,58 @@
         <w:spacing w:after="150" w:before="300"/>
       </w:pPr>
       <w:r>
-        <w:t xml:space="preserve">3. MTM con consecutive=YES — Transition Matrix</w:t>
-      </w:r>
-    </w:p>
-    <w:p>
-      <w:pPr>
-        <w:spacing w:after="150"/>
-      </w:pPr>
-      <w:r>
-        <w:rPr>
-          <w:b/>
-          <w:bCs/>
-        </w:rPr>
-        <w:t xml:space="preserve">Parametri: L_MAX=4, DELTA=86400s, consecutive=YES</w:t>
-      </w:r>
-    </w:p>
-    <w:p>
-      <w:pPr>
-        <w:spacing w:after="150" w:before="150"/>
+        <w:t>3. MTM con consecutive=YES — Transition Matrix (L_MAX=3, allineato a Task 1/Task 4)</w:t>
+      </w:r>
+    </w:p>
+    <w:p>
+      <w:r>
+        <w:t>A seguito della revisione dei parametri (vedi nota metodologica), la transition matrix MTM viene ricalcolata con L_MAX=3 (anziché L_MAX=4), per allinearla ai parametri usati nel benchmark di scalabilità del Task 4 e nella run originale su CollegeMsg del Task 1. consecutive=YES e N=5000 restano invariati. Vengono prodotte due versioni, una per ciascuna granularità candidata (30 minuti e 1 ora): la scelta finale verrà concordata con la correlatrice.</w:t>
+      </w:r>
+    </w:p>
+    <w:p>
+      <w:pPr>
+        <w:pStyle w:val="Heading2"/>
+      </w:pPr>
+      <w:r>
+        <w:t>3.1 Granularità 30 minuti (DELTA=1800s)</w:t>
+      </w:r>
+    </w:p>
+    <w:p>
+      <w:r>
+        <w:t>Parametri: L_MAX=3, DELTA=1800s, consecutive=YES, N=5000</w:t>
+      </w:r>
+    </w:p>
+    <w:p>
+      <w:pPr>
         <w:jc w:val="center"/>
       </w:pPr>
       <w:r>
         <w:drawing>
-          <wp:inline distT="0" distB="0" distL="0" distR="0">
-            <wp:extent cx="5040000" cy="2836198"/>
-            <wp:effectExtent t="0" r="0" b="0" l="0"/>
-            <wp:docPr id="1" name="" descr="" title=""/>
+          <wp:inline xmlns:a="http://schemas.openxmlformats.org/drawingml/2006/main" xmlns:pic="http://schemas.openxmlformats.org/drawingml/2006/picture">
+            <wp:extent cx="5038344" cy="2804059"/>
+            <wp:docPr id="2" name="Picture 2"/>
             <wp:cNvGraphicFramePr>
-              <a:graphicFrameLocks xmlns:a="http://schemas.openxmlformats.org/drawingml/2006/main" noChangeAspect="1"/>
+              <a:graphicFrameLocks noChangeAspect="1"/>
             </wp:cNvGraphicFramePr>
-            <a:graphic xmlns:a="http://schemas.openxmlformats.org/drawingml/2006/main">
+            <a:graphic>
               <a:graphicData uri="http://schemas.openxmlformats.org/drawingml/2006/picture">
-                <pic:pic xmlns:pic="http://schemas.openxmlformats.org/drawingml/2006/picture">
+                <pic:pic>
                   <pic:nvPicPr>
-                    <pic:cNvPr id="0" name="" descr=""/>
-                    <pic:cNvPicPr>
-                      <a:picLocks noChangeAspect="1" noChangeArrowheads="1"/>
-                    </pic:cNvPicPr>
+                    <pic:cNvPr id="0" name="mtm_transition_matrix_L3_30min.png"/>
+                    <pic:cNvPicPr/>
                   </pic:nvPicPr>
                   <pic:blipFill>
-                    <a:blip r:embed="rId7" cstate="none"/>
-                    <a:srcRect/>
+                    <a:blip r:embed="rId10"/>
                     <a:stretch>
                       <a:fillRect/>
                     </a:stretch>
                   </pic:blipFill>
-                  <pic:spPr bwMode="auto">
+                  <pic:spPr>
                     <a:xfrm>
                       <a:off x="0" y="0"/>
-                      <a:ext cx="5040000" cy="2836198"/>
+                      <a:ext cx="5038344" cy="2804059"/>
                     </a:xfrm>
-                    <a:prstGeom prst="rect">
-                      <a:avLst/>
-                    </a:prstGeom>
+                    <a:prstGeom prst="rect"/>
                   </pic:spPr>
                 </pic:pic>
               </a:graphicData>
@@ -434,593 +433,975 @@
       </w:r>
     </w:p>
     <w:p>
-      <w:pPr>
-        <w:spacing w:after="150"/>
-      </w:pPr>
-      <w:r>
-        <w:rPr>
-          <w:b/>
-          <w:bCs/>
-        </w:rPr>
-        <w:t xml:space="preserve">Tabella transizioni più frequenti:</w:t>
+      <w:r>
+        <w:t>Tabella transizioni più frequenti:</w:t>
       </w:r>
     </w:p>
     <w:tbl>
       <w:tblPr>
-        <w:tblW w:type="pct" w:w="100%"/>
-        <w:tblBorders>
-          <w:top w:val="single" w:color="auto" w:sz="4"/>
-          <w:left w:val="single" w:color="auto" w:sz="4"/>
-          <w:bottom w:val="single" w:color="auto" w:sz="4"/>
-          <w:right w:val="single" w:color="auto" w:sz="4"/>
-          <w:insideH w:val="single" w:color="auto" w:sz="4"/>
-          <w:insideV w:val="single" w:color="auto" w:sz="4"/>
-        </w:tblBorders>
+        <w:tblW w:type="auto" w:w="0"/>
+        <w:tblLook w:firstColumn="1" w:firstRow="1" w:lastColumn="0" w:lastRow="0" w:noHBand="0" w:noVBand="1" w:val="04A0"/>
       </w:tblPr>
       <w:tblGrid>
-        <w:gridCol w:w="2250"/>
-        <w:gridCol w:w="2250"/>
-        <w:gridCol w:w="2250"/>
-        <w:gridCol w:w="2250"/>
+        <w:gridCol w:w="2256"/>
+        <w:gridCol w:w="2256"/>
+        <w:gridCol w:w="2256"/>
+        <w:gridCol w:w="2256"/>
       </w:tblGrid>
       <w:tr>
-        <w:trPr>
-          <w:tblHeader/>
-        </w:trPr>
-        <w:tc>
-          <w:tcPr>
-            <w:tcBorders>
-              <w:top w:val="single" w:color="BFBFBF" w:sz="2"/>
-              <w:left w:val="single" w:color="BFBFBF" w:sz="2"/>
-              <w:bottom w:val="single" w:color="BFBFBF" w:sz="2"/>
-              <w:right w:val="single" w:color="BFBFBF" w:sz="2"/>
-            </w:tcBorders>
-            <w:shd w:fill="2E5496" w:val="clear"/>
-            <w:tcMar>
-              <w:top w:type="dxa" w:w="80"/>
-              <w:left w:type="dxa" w:w="100"/>
-              <w:bottom w:type="dxa" w:w="80"/>
-              <w:right w:type="dxa" w:w="100"/>
-            </w:tcMar>
+        <w:tc>
+          <w:tcPr>
+            <w:tcW w:type="dxa" w:w="2256"/>
           </w:tcPr>
           <w:p>
             <w:r>
               <w:rPr>
                 <w:b/>
-                <w:bCs/>
-                <w:color w:val="FFFFFF"/>
               </w:rPr>
-              <w:t xml:space="preserve">Prefisso</w:t>
-            </w:r>
-          </w:p>
-        </w:tc>
-        <w:tc>
-          <w:tcPr>
-            <w:tcBorders>
-              <w:top w:val="single" w:color="BFBFBF" w:sz="2"/>
-              <w:left w:val="single" w:color="BFBFBF" w:sz="2"/>
-              <w:bottom w:val="single" w:color="BFBFBF" w:sz="2"/>
-              <w:right w:val="single" w:color="BFBFBF" w:sz="2"/>
-            </w:tcBorders>
-            <w:shd w:fill="2E5496" w:val="clear"/>
-            <w:tcMar>
-              <w:top w:type="dxa" w:w="80"/>
-              <w:left w:type="dxa" w:w="100"/>
-              <w:bottom w:type="dxa" w:w="80"/>
-              <w:right w:type="dxa" w:w="100"/>
-            </w:tcMar>
+              <w:t>Prefisso</w:t>
+            </w:r>
+          </w:p>
+        </w:tc>
+        <w:tc>
+          <w:tcPr>
+            <w:tcW w:type="dxa" w:w="2256"/>
           </w:tcPr>
           <w:p>
             <w:r>
               <w:rPr>
                 <w:b/>
-                <w:bCs/>
-                <w:color w:val="FFFFFF"/>
               </w:rPr>
-              <w:t xml:space="preserve">Terzo evento</w:t>
-            </w:r>
-          </w:p>
-        </w:tc>
-        <w:tc>
-          <w:tcPr>
-            <w:tcBorders>
-              <w:top w:val="single" w:color="BFBFBF" w:sz="2"/>
-              <w:left w:val="single" w:color="BFBFBF" w:sz="2"/>
-              <w:bottom w:val="single" w:color="BFBFBF" w:sz="2"/>
-              <w:right w:val="single" w:color="BFBFBF" w:sz="2"/>
-            </w:tcBorders>
-            <w:shd w:fill="2E5496" w:val="clear"/>
-            <w:tcMar>
-              <w:top w:type="dxa" w:w="80"/>
-              <w:left w:type="dxa" w:w="100"/>
-              <w:bottom w:type="dxa" w:w="80"/>
-              <w:right w:type="dxa" w:w="100"/>
-            </w:tcMar>
+              <w:t>Terzo evento</w:t>
+            </w:r>
+          </w:p>
+        </w:tc>
+        <w:tc>
+          <w:tcPr>
+            <w:tcW w:type="dxa" w:w="2256"/>
           </w:tcPr>
           <w:p>
             <w:r>
               <w:rPr>
                 <w:b/>
-                <w:bCs/>
-                <w:color w:val="FFFFFF"/>
               </w:rPr>
-              <w:t xml:space="preserve">Probabilità</w:t>
-            </w:r>
-          </w:p>
-        </w:tc>
-        <w:tc>
-          <w:tcPr>
-            <w:tcBorders>
-              <w:top w:val="single" w:color="BFBFBF" w:sz="2"/>
-              <w:left w:val="single" w:color="BFBFBF" w:sz="2"/>
-              <w:bottom w:val="single" w:color="BFBFBF" w:sz="2"/>
-              <w:right w:val="single" w:color="BFBFBF" w:sz="2"/>
-            </w:tcBorders>
-            <w:shd w:fill="2E5496" w:val="clear"/>
-            <w:tcMar>
-              <w:top w:type="dxa" w:w="80"/>
-              <w:left w:type="dxa" w:w="100"/>
-              <w:bottom w:type="dxa" w:w="80"/>
-              <w:right w:type="dxa" w:w="100"/>
-            </w:tcMar>
+              <w:t>Probabilità</w:t>
+            </w:r>
+          </w:p>
+        </w:tc>
+        <w:tc>
+          <w:tcPr>
+            <w:tcW w:type="dxa" w:w="2256"/>
           </w:tcPr>
           <w:p>
             <w:r>
               <w:rPr>
                 <w:b/>
-                <w:bCs/>
-                <w:color w:val="FFFFFF"/>
               </w:rPr>
-              <w:t xml:space="preserve">Count</w:t>
-            </w:r>
-          </w:p>
-        </w:tc>
-      </w:tr>
-      <w:tr>
-        <w:tc>
-          <w:tcPr>
-            <w:tcBorders>
-              <w:top w:val="single" w:color="BFBFBF" w:sz="2"/>
-              <w:left w:val="single" w:color="BFBFBF" w:sz="2"/>
-              <w:bottom w:val="single" w:color="BFBFBF" w:sz="2"/>
-              <w:right w:val="single" w:color="BFBFBF" w:sz="2"/>
-            </w:tcBorders>
-            <w:tcMar>
-              <w:top w:type="dxa" w:w="60"/>
-              <w:left w:type="dxa" w:w="100"/>
-              <w:bottom w:type="dxa" w:w="60"/>
-              <w:right w:type="dxa" w:w="100"/>
-            </w:tcMar>
-          </w:tcPr>
-          <w:p>
-            <w:r>
-              <w:t xml:space="preserve">0102</w:t>
-            </w:r>
-          </w:p>
-        </w:tc>
-        <w:tc>
-          <w:tcPr>
-            <w:tcBorders>
-              <w:top w:val="single" w:color="BFBFBF" w:sz="2"/>
-              <w:left w:val="single" w:color="BFBFBF" w:sz="2"/>
-              <w:bottom w:val="single" w:color="BFBFBF" w:sz="2"/>
-              <w:right w:val="single" w:color="BFBFBF" w:sz="2"/>
-            </w:tcBorders>
-            <w:tcMar>
-              <w:top w:type="dxa" w:w="60"/>
-              <w:left w:type="dxa" w:w="100"/>
-              <w:bottom w:type="dxa" w:w="60"/>
-              <w:right w:type="dxa" w:w="100"/>
-            </w:tcMar>
-          </w:tcPr>
-          <w:p>
-            <w:r>
-              <w:t xml:space="preserve">03</w:t>
-            </w:r>
-          </w:p>
-        </w:tc>
-        <w:tc>
-          <w:tcPr>
-            <w:tcBorders>
-              <w:top w:val="single" w:color="BFBFBF" w:sz="2"/>
-              <w:left w:val="single" w:color="BFBFBF" w:sz="2"/>
-              <w:bottom w:val="single" w:color="BFBFBF" w:sz="2"/>
-              <w:right w:val="single" w:color="BFBFBF" w:sz="2"/>
-            </w:tcBorders>
-            <w:tcMar>
-              <w:top w:type="dxa" w:w="60"/>
-              <w:left w:type="dxa" w:w="100"/>
-              <w:bottom w:type="dxa" w:w="60"/>
-              <w:right w:type="dxa" w:w="100"/>
-            </w:tcMar>
-          </w:tcPr>
-          <w:p>
-            <w:r>
-              <w:t xml:space="preserve">0.41</w:t>
-            </w:r>
-          </w:p>
-        </w:tc>
-        <w:tc>
-          <w:tcPr>
-            <w:tcBorders>
-              <w:top w:val="single" w:color="BFBFBF" w:sz="2"/>
-              <w:left w:val="single" w:color="BFBFBF" w:sz="2"/>
-              <w:bottom w:val="single" w:color="BFBFBF" w:sz="2"/>
-              <w:right w:val="single" w:color="BFBFBF" w:sz="2"/>
-            </w:tcBorders>
-            <w:tcMar>
-              <w:top w:type="dxa" w:w="60"/>
-              <w:left w:type="dxa" w:w="100"/>
-              <w:bottom w:type="dxa" w:w="60"/>
-              <w:right w:type="dxa" w:w="100"/>
-            </w:tcMar>
-          </w:tcPr>
-          <w:p>
-            <w:r>
-              <w:t xml:space="preserve">196</w:t>
-            </w:r>
-          </w:p>
-        </w:tc>
-      </w:tr>
-      <w:tr>
-        <w:tc>
-          <w:tcPr>
-            <w:tcBorders>
-              <w:top w:val="single" w:color="BFBFBF" w:sz="2"/>
-              <w:left w:val="single" w:color="BFBFBF" w:sz="2"/>
-              <w:bottom w:val="single" w:color="BFBFBF" w:sz="2"/>
-              <w:right w:val="single" w:color="BFBFBF" w:sz="2"/>
-            </w:tcBorders>
-            <w:tcMar>
-              <w:top w:type="dxa" w:w="60"/>
-              <w:left w:type="dxa" w:w="100"/>
-              <w:bottom w:type="dxa" w:w="60"/>
-              <w:right w:type="dxa" w:w="100"/>
-            </w:tcMar>
-          </w:tcPr>
-          <w:p>
-            <w:r>
-              <w:t xml:space="preserve">0101</w:t>
-            </w:r>
-          </w:p>
-        </w:tc>
-        <w:tc>
-          <w:tcPr>
-            <w:tcBorders>
-              <w:top w:val="single" w:color="BFBFBF" w:sz="2"/>
-              <w:left w:val="single" w:color="BFBFBF" w:sz="2"/>
-              <w:bottom w:val="single" w:color="BFBFBF" w:sz="2"/>
-              <w:right w:val="single" w:color="BFBFBF" w:sz="2"/>
-            </w:tcBorders>
-            <w:tcMar>
-              <w:top w:type="dxa" w:w="60"/>
-              <w:left w:type="dxa" w:w="100"/>
-              <w:bottom w:type="dxa" w:w="60"/>
-              <w:right w:type="dxa" w:w="100"/>
-            </w:tcMar>
-          </w:tcPr>
-          <w:p>
-            <w:r>
-              <w:t xml:space="preserve">01</w:t>
-            </w:r>
-          </w:p>
-        </w:tc>
-        <w:tc>
-          <w:tcPr>
-            <w:tcBorders>
-              <w:top w:val="single" w:color="BFBFBF" w:sz="2"/>
-              <w:left w:val="single" w:color="BFBFBF" w:sz="2"/>
-              <w:bottom w:val="single" w:color="BFBFBF" w:sz="2"/>
-              <w:right w:val="single" w:color="BFBFBF" w:sz="2"/>
-            </w:tcBorders>
-            <w:tcMar>
-              <w:top w:type="dxa" w:w="60"/>
-              <w:left w:type="dxa" w:w="100"/>
-              <w:bottom w:type="dxa" w:w="60"/>
-              <w:right w:type="dxa" w:w="100"/>
-            </w:tcMar>
-          </w:tcPr>
-          <w:p>
-            <w:r>
-              <w:t xml:space="preserve">0.39</w:t>
-            </w:r>
-          </w:p>
-        </w:tc>
-        <w:tc>
-          <w:tcPr>
-            <w:tcBorders>
-              <w:top w:val="single" w:color="BFBFBF" w:sz="2"/>
-              <w:left w:val="single" w:color="BFBFBF" w:sz="2"/>
-              <w:bottom w:val="single" w:color="BFBFBF" w:sz="2"/>
-              <w:right w:val="single" w:color="BFBFBF" w:sz="2"/>
-            </w:tcBorders>
-            <w:tcMar>
-              <w:top w:type="dxa" w:w="60"/>
-              <w:left w:type="dxa" w:w="100"/>
-              <w:bottom w:type="dxa" w:w="60"/>
-              <w:right w:type="dxa" w:w="100"/>
-            </w:tcMar>
-          </w:tcPr>
-          <w:p>
-            <w:r>
-              <w:t xml:space="preserve">81</w:t>
-            </w:r>
-          </w:p>
-        </w:tc>
-      </w:tr>
-      <w:tr>
-        <w:tc>
-          <w:tcPr>
-            <w:tcBorders>
-              <w:top w:val="single" w:color="BFBFBF" w:sz="2"/>
-              <w:left w:val="single" w:color="BFBFBF" w:sz="2"/>
-              <w:bottom w:val="single" w:color="BFBFBF" w:sz="2"/>
-              <w:right w:val="single" w:color="BFBFBF" w:sz="2"/>
-            </w:tcBorders>
-            <w:tcMar>
-              <w:top w:type="dxa" w:w="60"/>
-              <w:left w:type="dxa" w:w="100"/>
-              <w:bottom w:type="dxa" w:w="60"/>
-              <w:right w:type="dxa" w:w="100"/>
-            </w:tcMar>
-          </w:tcPr>
-          <w:p>
-            <w:r>
-              <w:t xml:space="preserve">0110</w:t>
-            </w:r>
-          </w:p>
-        </w:tc>
-        <w:tc>
-          <w:tcPr>
-            <w:tcBorders>
-              <w:top w:val="single" w:color="BFBFBF" w:sz="2"/>
-              <w:left w:val="single" w:color="BFBFBF" w:sz="2"/>
-              <w:bottom w:val="single" w:color="BFBFBF" w:sz="2"/>
-              <w:right w:val="single" w:color="BFBFBF" w:sz="2"/>
-            </w:tcBorders>
-            <w:tcMar>
-              <w:top w:type="dxa" w:w="60"/>
-              <w:left w:type="dxa" w:w="100"/>
-              <w:bottom w:type="dxa" w:w="60"/>
-              <w:right w:type="dxa" w:w="100"/>
-            </w:tcMar>
-          </w:tcPr>
-          <w:p>
-            <w:r>
-              <w:t xml:space="preserve">01</w:t>
-            </w:r>
-          </w:p>
-        </w:tc>
-        <w:tc>
-          <w:tcPr>
-            <w:tcBorders>
-              <w:top w:val="single" w:color="BFBFBF" w:sz="2"/>
-              <w:left w:val="single" w:color="BFBFBF" w:sz="2"/>
-              <w:bottom w:val="single" w:color="BFBFBF" w:sz="2"/>
-              <w:right w:val="single" w:color="BFBFBF" w:sz="2"/>
-            </w:tcBorders>
-            <w:tcMar>
-              <w:top w:type="dxa" w:w="60"/>
-              <w:left w:type="dxa" w:w="100"/>
-              <w:bottom w:type="dxa" w:w="60"/>
-              <w:right w:type="dxa" w:w="100"/>
-            </w:tcMar>
-          </w:tcPr>
-          <w:p>
-            <w:r>
-              <w:t xml:space="preserve">0.37</w:t>
-            </w:r>
-          </w:p>
-        </w:tc>
-        <w:tc>
-          <w:tcPr>
-            <w:tcBorders>
-              <w:top w:val="single" w:color="BFBFBF" w:sz="2"/>
-              <w:left w:val="single" w:color="BFBFBF" w:sz="2"/>
-              <w:bottom w:val="single" w:color="BFBFBF" w:sz="2"/>
-              <w:right w:val="single" w:color="BFBFBF" w:sz="2"/>
-            </w:tcBorders>
-            <w:tcMar>
-              <w:top w:type="dxa" w:w="60"/>
-              <w:left w:type="dxa" w:w="100"/>
-              <w:bottom w:type="dxa" w:w="60"/>
-              <w:right w:type="dxa" w:w="100"/>
-            </w:tcMar>
-          </w:tcPr>
-          <w:p>
-            <w:r>
-              <w:t xml:space="preserve">51</w:t>
-            </w:r>
-          </w:p>
-        </w:tc>
-      </w:tr>
-      <w:tr>
-        <w:tc>
-          <w:tcPr>
-            <w:tcBorders>
-              <w:top w:val="single" w:color="BFBFBF" w:sz="2"/>
-              <w:left w:val="single" w:color="BFBFBF" w:sz="2"/>
-              <w:bottom w:val="single" w:color="BFBFBF" w:sz="2"/>
-              <w:right w:val="single" w:color="BFBFBF" w:sz="2"/>
-            </w:tcBorders>
-            <w:tcMar>
-              <w:top w:type="dxa" w:w="60"/>
-              <w:left w:type="dxa" w:w="100"/>
-              <w:bottom w:type="dxa" w:w="60"/>
-              <w:right w:type="dxa" w:w="100"/>
-            </w:tcMar>
-          </w:tcPr>
-          <w:p>
-            <w:r>
-              <w:t xml:space="preserve">0120</w:t>
-            </w:r>
-          </w:p>
-        </w:tc>
-        <w:tc>
-          <w:tcPr>
-            <w:tcBorders>
-              <w:top w:val="single" w:color="BFBFBF" w:sz="2"/>
-              <w:left w:val="single" w:color="BFBFBF" w:sz="2"/>
-              <w:bottom w:val="single" w:color="BFBFBF" w:sz="2"/>
-              <w:right w:val="single" w:color="BFBFBF" w:sz="2"/>
-            </w:tcBorders>
-            <w:tcMar>
-              <w:top w:type="dxa" w:w="60"/>
-              <w:left w:type="dxa" w:w="100"/>
-              <w:bottom w:type="dxa" w:w="60"/>
-              <w:right w:type="dxa" w:w="100"/>
-            </w:tcMar>
-          </w:tcPr>
-          <w:p>
-            <w:r>
-              <w:t xml:space="preserve">23</w:t>
-            </w:r>
-          </w:p>
-        </w:tc>
-        <w:tc>
-          <w:tcPr>
-            <w:tcBorders>
-              <w:top w:val="single" w:color="BFBFBF" w:sz="2"/>
-              <w:left w:val="single" w:color="BFBFBF" w:sz="2"/>
-              <w:bottom w:val="single" w:color="BFBFBF" w:sz="2"/>
-              <w:right w:val="single" w:color="BFBFBF" w:sz="2"/>
-            </w:tcBorders>
-            <w:tcMar>
-              <w:top w:type="dxa" w:w="60"/>
-              <w:left w:type="dxa" w:w="100"/>
-              <w:bottom w:type="dxa" w:w="60"/>
-              <w:right w:type="dxa" w:w="100"/>
-            </w:tcMar>
-          </w:tcPr>
-          <w:p>
-            <w:r>
-              <w:t xml:space="preserve">0.32</w:t>
-            </w:r>
-          </w:p>
-        </w:tc>
-        <w:tc>
-          <w:tcPr>
-            <w:tcBorders>
-              <w:top w:val="single" w:color="BFBFBF" w:sz="2"/>
-              <w:left w:val="single" w:color="BFBFBF" w:sz="2"/>
-              <w:bottom w:val="single" w:color="BFBFBF" w:sz="2"/>
-              <w:right w:val="single" w:color="BFBFBF" w:sz="2"/>
-            </w:tcBorders>
-            <w:tcMar>
-              <w:top w:type="dxa" w:w="60"/>
-              <w:left w:type="dxa" w:w="100"/>
-              <w:bottom w:type="dxa" w:w="60"/>
-              <w:right w:type="dxa" w:w="100"/>
-            </w:tcMar>
-          </w:tcPr>
-          <w:p>
-            <w:r>
-              <w:t xml:space="preserve">58</w:t>
-            </w:r>
-          </w:p>
-        </w:tc>
-      </w:tr>
-      <w:tr>
-        <w:tc>
-          <w:tcPr>
-            <w:tcBorders>
-              <w:top w:val="single" w:color="BFBFBF" w:sz="2"/>
-              <w:left w:val="single" w:color="BFBFBF" w:sz="2"/>
-              <w:bottom w:val="single" w:color="BFBFBF" w:sz="2"/>
-              <w:right w:val="single" w:color="BFBFBF" w:sz="2"/>
-            </w:tcBorders>
-            <w:tcMar>
-              <w:top w:type="dxa" w:w="60"/>
-              <w:left w:type="dxa" w:w="100"/>
-              <w:bottom w:type="dxa" w:w="60"/>
-              <w:right w:type="dxa" w:w="100"/>
-            </w:tcMar>
-          </w:tcPr>
-          <w:p>
-            <w:r>
-              <w:t xml:space="preserve">0121</w:t>
-            </w:r>
-          </w:p>
-        </w:tc>
-        <w:tc>
-          <w:tcPr>
-            <w:tcBorders>
-              <w:top w:val="single" w:color="BFBFBF" w:sz="2"/>
-              <w:left w:val="single" w:color="BFBFBF" w:sz="2"/>
-              <w:bottom w:val="single" w:color="BFBFBF" w:sz="2"/>
-              <w:right w:val="single" w:color="BFBFBF" w:sz="2"/>
-            </w:tcBorders>
-            <w:tcMar>
-              <w:top w:type="dxa" w:w="60"/>
-              <w:left w:type="dxa" w:w="100"/>
-              <w:bottom w:type="dxa" w:w="60"/>
-              <w:right w:type="dxa" w:w="100"/>
-            </w:tcMar>
-          </w:tcPr>
-          <w:p>
-            <w:r>
-              <w:t xml:space="preserve">23</w:t>
-            </w:r>
-          </w:p>
-        </w:tc>
-        <w:tc>
-          <w:tcPr>
-            <w:tcBorders>
-              <w:top w:val="single" w:color="BFBFBF" w:sz="2"/>
-              <w:left w:val="single" w:color="BFBFBF" w:sz="2"/>
-              <w:bottom w:val="single" w:color="BFBFBF" w:sz="2"/>
-              <w:right w:val="single" w:color="BFBFBF" w:sz="2"/>
-            </w:tcBorders>
-            <w:tcMar>
-              <w:top w:type="dxa" w:w="60"/>
-              <w:left w:type="dxa" w:w="100"/>
-              <w:bottom w:type="dxa" w:w="60"/>
-              <w:right w:type="dxa" w:w="100"/>
-            </w:tcMar>
-          </w:tcPr>
-          <w:p>
-            <w:r>
-              <w:t xml:space="preserve">0.29</w:t>
-            </w:r>
-          </w:p>
-        </w:tc>
-        <w:tc>
-          <w:tcPr>
-            <w:tcBorders>
-              <w:top w:val="single" w:color="BFBFBF" w:sz="2"/>
-              <w:left w:val="single" w:color="BFBFBF" w:sz="2"/>
-              <w:bottom w:val="single" w:color="BFBFBF" w:sz="2"/>
-              <w:right w:val="single" w:color="BFBFBF" w:sz="2"/>
-            </w:tcBorders>
-            <w:tcMar>
-              <w:top w:type="dxa" w:w="60"/>
-              <w:left w:type="dxa" w:w="100"/>
-              <w:bottom w:type="dxa" w:w="60"/>
-              <w:right w:type="dxa" w:w="100"/>
-            </w:tcMar>
-          </w:tcPr>
-          <w:p>
-            <w:r>
-              <w:t xml:space="preserve">85</w:t>
+              <w:t>Count</w:t>
+            </w:r>
+          </w:p>
+        </w:tc>
+      </w:tr>
+      <w:tr>
+        <w:tc>
+          <w:tcPr>
+            <w:tcW w:type="dxa" w:w="2256"/>
+          </w:tcPr>
+          <w:p>
+            <w:r>
+              <w:t>0101</w:t>
+            </w:r>
+          </w:p>
+        </w:tc>
+        <w:tc>
+          <w:tcPr>
+            <w:tcW w:type="dxa" w:w="2256"/>
+          </w:tcPr>
+          <w:p>
+            <w:r>
+              <w:t>01</w:t>
+            </w:r>
+          </w:p>
+        </w:tc>
+        <w:tc>
+          <w:tcPr>
+            <w:tcW w:type="dxa" w:w="2256"/>
+          </w:tcPr>
+          <w:p>
+            <w:r>
+              <w:t>0.4467</w:t>
+            </w:r>
+          </w:p>
+        </w:tc>
+        <w:tc>
+          <w:tcPr>
+            <w:tcW w:type="dxa" w:w="2256"/>
+          </w:tcPr>
+          <w:p>
+            <w:r>
+              <w:t>109</w:t>
+            </w:r>
+          </w:p>
+        </w:tc>
+      </w:tr>
+      <w:tr>
+        <w:tc>
+          <w:tcPr>
+            <w:tcW w:type="dxa" w:w="2256"/>
+          </w:tcPr>
+          <w:p>
+            <w:r>
+              <w:t>0102</w:t>
+            </w:r>
+          </w:p>
+        </w:tc>
+        <w:tc>
+          <w:tcPr>
+            <w:tcW w:type="dxa" w:w="2256"/>
+          </w:tcPr>
+          <w:p>
+            <w:r>
+              <w:t>03</w:t>
+            </w:r>
+          </w:p>
+        </w:tc>
+        <w:tc>
+          <w:tcPr>
+            <w:tcW w:type="dxa" w:w="2256"/>
+          </w:tcPr>
+          <w:p>
+            <w:r>
+              <w:t>0.4269</w:t>
+            </w:r>
+          </w:p>
+        </w:tc>
+        <w:tc>
+          <w:tcPr>
+            <w:tcW w:type="dxa" w:w="2256"/>
+          </w:tcPr>
+          <w:p>
+            <w:r>
+              <w:t>225</w:t>
+            </w:r>
+          </w:p>
+        </w:tc>
+      </w:tr>
+      <w:tr>
+        <w:tc>
+          <w:tcPr>
+            <w:tcW w:type="dxa" w:w="2256"/>
+          </w:tcPr>
+          <w:p>
+            <w:r>
+              <w:t>0110</w:t>
+            </w:r>
+          </w:p>
+        </w:tc>
+        <w:tc>
+          <w:tcPr>
+            <w:tcW w:type="dxa" w:w="2256"/>
+          </w:tcPr>
+          <w:p>
+            <w:r>
+              <w:t>01</w:t>
+            </w:r>
+          </w:p>
+        </w:tc>
+        <w:tc>
+          <w:tcPr>
+            <w:tcW w:type="dxa" w:w="2256"/>
+          </w:tcPr>
+          <w:p>
+            <w:r>
+              <w:t>0.4118</w:t>
+            </w:r>
+          </w:p>
+        </w:tc>
+        <w:tc>
+          <w:tcPr>
+            <w:tcW w:type="dxa" w:w="2256"/>
+          </w:tcPr>
+          <w:p>
+            <w:r>
+              <w:t>63</w:t>
+            </w:r>
+          </w:p>
+        </w:tc>
+      </w:tr>
+      <w:tr>
+        <w:tc>
+          <w:tcPr>
+            <w:tcW w:type="dxa" w:w="2256"/>
+          </w:tcPr>
+          <w:p>
+            <w:r>
+              <w:t>0120</w:t>
+            </w:r>
+          </w:p>
+        </w:tc>
+        <w:tc>
+          <w:tcPr>
+            <w:tcW w:type="dxa" w:w="2256"/>
+          </w:tcPr>
+          <w:p>
+            <w:r>
+              <w:t>23</w:t>
+            </w:r>
+          </w:p>
+        </w:tc>
+        <w:tc>
+          <w:tcPr>
+            <w:tcW w:type="dxa" w:w="2256"/>
+          </w:tcPr>
+          <w:p>
+            <w:r>
+              <w:t>0.2727</w:t>
+            </w:r>
+          </w:p>
+        </w:tc>
+        <w:tc>
+          <w:tcPr>
+            <w:tcW w:type="dxa" w:w="2256"/>
+          </w:tcPr>
+          <w:p>
+            <w:r>
+              <w:t>42</w:t>
+            </w:r>
+          </w:p>
+        </w:tc>
+      </w:tr>
+      <w:tr>
+        <w:tc>
+          <w:tcPr>
+            <w:tcW w:type="dxa" w:w="2256"/>
+          </w:tcPr>
+          <w:p>
+            <w:r>
+              <w:t>0121</w:t>
+            </w:r>
+          </w:p>
+        </w:tc>
+        <w:tc>
+          <w:tcPr>
+            <w:tcW w:type="dxa" w:w="2256"/>
+          </w:tcPr>
+          <w:p>
+            <w:r>
+              <w:t>23</w:t>
+            </w:r>
+          </w:p>
+        </w:tc>
+        <w:tc>
+          <w:tcPr>
+            <w:tcW w:type="dxa" w:w="2256"/>
+          </w:tcPr>
+          <w:p>
+            <w:r>
+              <w:t>0.2314</w:t>
+            </w:r>
+          </w:p>
+        </w:tc>
+        <w:tc>
+          <w:tcPr>
+            <w:tcW w:type="dxa" w:w="2256"/>
+          </w:tcPr>
+          <w:p>
+            <w:r>
+              <w:t>59</w:t>
             </w:r>
           </w:p>
         </w:tc>
       </w:tr>
     </w:tbl>
     <w:p>
-      <w:pPr>
-        <w:spacing w:after="150"/>
-      </w:pPr>
-      <w:r>
-        <w:t xml:space="preserve">Dimensioni matrice: 6 prefissi × 12 terzi-eventi, 53/72 celle osservate (73.6%).</w:t>
-      </w:r>
-    </w:p>
-    <w:p>
-      <w:pPr>
-        <w:spacing w:after="150"/>
-      </w:pPr>
-      <w:r>
-        <w:t xml:space="preserve">Osservazione: transizione dominante 0102→03 (P=0.41) — pattern hub che si espande verso nodi sempre nuovi. Nessun prefisso ha P&gt;0.5.</w:t>
+      <w:r>
+        <w:t>La probabilità è condizionata sul prefisso: P(terzo evento | prefisso) = count(prefisso → terzo evento) / count(prefisso → qualsiasi evento). Il Count indica il numero di occorrenze della specifica transizione prefisso → terzo evento osservata nel campione.</w:t>
+      </w:r>
+    </w:p>
+    <w:p>
+      <w:r>
+        <w:t>Dimensioni matrice: 6 prefissi × 12 terzi-eventi, 53/72 celle osservate (73.6%).</w:t>
+      </w:r>
+    </w:p>
+    <w:p>
+      <w:pPr>
+        <w:pStyle w:val="Heading2"/>
+      </w:pPr>
+      <w:r>
+        <w:t>3.2 Granularità 1 ora (DELTA=3600s)</w:t>
+      </w:r>
+    </w:p>
+    <w:p>
+      <w:r>
+        <w:t>Parametri: L_MAX=3, DELTA=3600s, consecutive=YES, N=5000</w:t>
+      </w:r>
+    </w:p>
+    <w:p>
+      <w:pPr>
+        <w:jc w:val="center"/>
+      </w:pPr>
+      <w:r>
+        <w:drawing>
+          <wp:inline xmlns:a="http://schemas.openxmlformats.org/drawingml/2006/main" xmlns:pic="http://schemas.openxmlformats.org/drawingml/2006/picture">
+            <wp:extent cx="5038344" cy="2804059"/>
+            <wp:docPr id="2" name="Picture 2"/>
+            <wp:cNvGraphicFramePr>
+              <a:graphicFrameLocks noChangeAspect="1"/>
+            </wp:cNvGraphicFramePr>
+            <a:graphic>
+              <a:graphicData uri="http://schemas.openxmlformats.org/drawingml/2006/picture">
+                <pic:pic>
+                  <pic:nvPicPr>
+                    <pic:cNvPr id="0" name="mtm_transition_matrix_L3_1h.png"/>
+                    <pic:cNvPicPr/>
+                  </pic:nvPicPr>
+                  <pic:blipFill>
+                    <a:blip r:embed="rId11"/>
+                    <a:stretch>
+                      <a:fillRect/>
+                    </a:stretch>
+                  </pic:blipFill>
+                  <pic:spPr>
+                    <a:xfrm>
+                      <a:off x="0" y="0"/>
+                      <a:ext cx="5038344" cy="2804059"/>
+                    </a:xfrm>
+                    <a:prstGeom prst="rect"/>
+                  </pic:spPr>
+                </pic:pic>
+              </a:graphicData>
+            </a:graphic>
+          </wp:inline>
+        </w:drawing>
+      </w:r>
+    </w:p>
+    <w:p>
+      <w:r>
+        <w:t>Tabella transizioni più frequenti:</w:t>
+      </w:r>
+    </w:p>
+    <w:tbl>
+      <w:tblPr>
+        <w:tblW w:type="auto" w:w="0"/>
+        <w:tblLook w:firstColumn="1" w:firstRow="1" w:lastColumn="0" w:lastRow="0" w:noHBand="0" w:noVBand="1" w:val="04A0"/>
+      </w:tblPr>
+      <w:tblGrid>
+        <w:gridCol w:w="2256"/>
+        <w:gridCol w:w="2256"/>
+        <w:gridCol w:w="2256"/>
+        <w:gridCol w:w="2256"/>
+      </w:tblGrid>
+      <w:tr>
+        <w:tc>
+          <w:tcPr>
+            <w:tcW w:type="dxa" w:w="2256"/>
+          </w:tcPr>
+          <w:p>
+            <w:r>
+              <w:rPr>
+                <w:b/>
+              </w:rPr>
+              <w:t>Prefisso</w:t>
+            </w:r>
+          </w:p>
+        </w:tc>
+        <w:tc>
+          <w:tcPr>
+            <w:tcW w:type="dxa" w:w="2256"/>
+          </w:tcPr>
+          <w:p>
+            <w:r>
+              <w:rPr>
+                <w:b/>
+              </w:rPr>
+              <w:t>Terzo evento</w:t>
+            </w:r>
+          </w:p>
+        </w:tc>
+        <w:tc>
+          <w:tcPr>
+            <w:tcW w:type="dxa" w:w="2256"/>
+          </w:tcPr>
+          <w:p>
+            <w:r>
+              <w:rPr>
+                <w:b/>
+              </w:rPr>
+              <w:t>Probabilità</w:t>
+            </w:r>
+          </w:p>
+        </w:tc>
+        <w:tc>
+          <w:tcPr>
+            <w:tcW w:type="dxa" w:w="2256"/>
+          </w:tcPr>
+          <w:p>
+            <w:r>
+              <w:rPr>
+                <w:b/>
+              </w:rPr>
+              <w:t>Count</w:t>
+            </w:r>
+          </w:p>
+        </w:tc>
+      </w:tr>
+      <w:tr>
+        <w:tc>
+          <w:tcPr>
+            <w:tcW w:type="dxa" w:w="2256"/>
+          </w:tcPr>
+          <w:p>
+            <w:r>
+              <w:t>0101</w:t>
+            </w:r>
+          </w:p>
+        </w:tc>
+        <w:tc>
+          <w:tcPr>
+            <w:tcW w:type="dxa" w:w="2256"/>
+          </w:tcPr>
+          <w:p>
+            <w:r>
+              <w:t>01</w:t>
+            </w:r>
+          </w:p>
+        </w:tc>
+        <w:tc>
+          <w:tcPr>
+            <w:tcW w:type="dxa" w:w="2256"/>
+          </w:tcPr>
+          <w:p>
+            <w:r>
+              <w:t>0.4508</w:t>
+            </w:r>
+          </w:p>
+        </w:tc>
+        <w:tc>
+          <w:tcPr>
+            <w:tcW w:type="dxa" w:w="2256"/>
+          </w:tcPr>
+          <w:p>
+            <w:r>
+              <w:t>110</w:t>
+            </w:r>
+          </w:p>
+        </w:tc>
+      </w:tr>
+      <w:tr>
+        <w:tc>
+          <w:tcPr>
+            <w:tcW w:type="dxa" w:w="2256"/>
+          </w:tcPr>
+          <w:p>
+            <w:r>
+              <w:t>0110</w:t>
+            </w:r>
+          </w:p>
+        </w:tc>
+        <w:tc>
+          <w:tcPr>
+            <w:tcW w:type="dxa" w:w="2256"/>
+          </w:tcPr>
+          <w:p>
+            <w:r>
+              <w:t>01</w:t>
+            </w:r>
+          </w:p>
+        </w:tc>
+        <w:tc>
+          <w:tcPr>
+            <w:tcW w:type="dxa" w:w="2256"/>
+          </w:tcPr>
+          <w:p>
+            <w:r>
+              <w:t>0.3910</w:t>
+            </w:r>
+          </w:p>
+        </w:tc>
+        <w:tc>
+          <w:tcPr>
+            <w:tcW w:type="dxa" w:w="2256"/>
+          </w:tcPr>
+          <w:p>
+            <w:r>
+              <w:t>61</w:t>
+            </w:r>
+          </w:p>
+        </w:tc>
+      </w:tr>
+      <w:tr>
+        <w:tc>
+          <w:tcPr>
+            <w:tcW w:type="dxa" w:w="2256"/>
+          </w:tcPr>
+          <w:p>
+            <w:r>
+              <w:t>0102</w:t>
+            </w:r>
+          </w:p>
+        </w:tc>
+        <w:tc>
+          <w:tcPr>
+            <w:tcW w:type="dxa" w:w="2256"/>
+          </w:tcPr>
+          <w:p>
+            <w:r>
+              <w:t>03</w:t>
+            </w:r>
+          </w:p>
+        </w:tc>
+        <w:tc>
+          <w:tcPr>
+            <w:tcW w:type="dxa" w:w="2256"/>
+          </w:tcPr>
+          <w:p>
+            <w:r>
+              <w:t>0.3752</w:t>
+            </w:r>
+          </w:p>
+        </w:tc>
+        <w:tc>
+          <w:tcPr>
+            <w:tcW w:type="dxa" w:w="2256"/>
+          </w:tcPr>
+          <w:p>
+            <w:r>
+              <w:t>212</w:t>
+            </w:r>
+          </w:p>
+        </w:tc>
+      </w:tr>
+      <w:tr>
+        <w:tc>
+          <w:tcPr>
+            <w:tcW w:type="dxa" w:w="2256"/>
+          </w:tcPr>
+          <w:p>
+            <w:r>
+              <w:t>0120</w:t>
+            </w:r>
+          </w:p>
+        </w:tc>
+        <w:tc>
+          <w:tcPr>
+            <w:tcW w:type="dxa" w:w="2256"/>
+          </w:tcPr>
+          <w:p>
+            <w:r>
+              <w:t>23</w:t>
+            </w:r>
+          </w:p>
+        </w:tc>
+        <w:tc>
+          <w:tcPr>
+            <w:tcW w:type="dxa" w:w="2256"/>
+          </w:tcPr>
+          <w:p>
+            <w:r>
+              <w:t>0.2841</w:t>
+            </w:r>
+          </w:p>
+        </w:tc>
+        <w:tc>
+          <w:tcPr>
+            <w:tcW w:type="dxa" w:w="2256"/>
+          </w:tcPr>
+          <w:p>
+            <w:r>
+              <w:t>50</w:t>
+            </w:r>
+          </w:p>
+        </w:tc>
+      </w:tr>
+      <w:tr>
+        <w:tc>
+          <w:tcPr>
+            <w:tcW w:type="dxa" w:w="2256"/>
+          </w:tcPr>
+          <w:p>
+            <w:r>
+              <w:t>0121</w:t>
+            </w:r>
+          </w:p>
+        </w:tc>
+        <w:tc>
+          <w:tcPr>
+            <w:tcW w:type="dxa" w:w="2256"/>
+          </w:tcPr>
+          <w:p>
+            <w:r>
+              <w:t>23</w:t>
+            </w:r>
+          </w:p>
+        </w:tc>
+        <w:tc>
+          <w:tcPr>
+            <w:tcW w:type="dxa" w:w="2256"/>
+          </w:tcPr>
+          <w:p>
+            <w:r>
+              <w:t>0.2310</w:t>
+            </w:r>
+          </w:p>
+        </w:tc>
+        <w:tc>
+          <w:tcPr>
+            <w:tcW w:type="dxa" w:w="2256"/>
+          </w:tcPr>
+          <w:p>
+            <w:r>
+              <w:t>64</w:t>
+            </w:r>
+          </w:p>
+        </w:tc>
+      </w:tr>
+    </w:tbl>
+    <w:p>
+      <w:r>
+        <w:t>La probabilità è condizionata sul prefisso: P(terzo evento | prefisso) = count(prefisso → terzo evento) / count(prefisso → qualsiasi evento). Il Count indica il numero di occorrenze della specifica transizione prefisso → terzo evento osservata nel campione.</w:t>
+      </w:r>
+    </w:p>
+    <w:p>
+      <w:r>
+        <w:t>Dimensioni matrice: 6 prefissi × 12 terzi-eventi, 54/72 celle osservate (75.0%).</w:t>
+      </w:r>
+    </w:p>
+    <w:p>
+      <w:pPr>
+        <w:pStyle w:val="Heading2"/>
+      </w:pPr>
+      <w:r>
+        <w:t>3.3 Confronto con la versione originale (L_MAX=4, DELTA=86400s)</w:t>
+      </w:r>
+    </w:p>
+    <w:p>
+      <w:r>
+        <w:t>La versione originale (L_MAX=4, DELTA=86400s = 1 giorno) aveva la stessa forma (6×12, 53/72 celle osservate, 73.6%) e lo stesso insieme di prefissi dominanti (0101, 0102, 0110, 0120, 0121). Le probabilità osservate nelle nuove versioni differiscono solo leggermente da quella originale: differenza media assoluta 0.021 (max 0.088) per la versione a 30 minuti, e 0.018 (max 0.061) per la versione a 1 ora, su 53 celle confrontabili in entrambi i casi.</w:t>
+      </w:r>
+    </w:p>
+    <w:p>
+      <w:r>
+        <w:t>Non si osservano differenze qualitative significative: cambia solo la piccola perturbazione numerica dovuta alla diversa finestra di memoria (DELTA) e al numero massimo di eventi per motif (L_MAX). L'unica variazione degna di nota è lo scambio del transizione dominante: nella versione originale la transizione più probabile è 0102→03 (P=0.41), mentre nelle versioni L_MAX=3 diventa 0101→01 (ripetizione dello stesso arco, P≈0.45), con 0102→03 che scende comunque al secondo/terzo posto. Questo indica che la scelta di L_MAX (3 vs 4) ha un impatto misurabile ma contenuto sull'ordinamento delle transizioni più probabili, non sulla struttura complessiva della matrice.</w:t>
+      </w:r>
+    </w:p>
+    <w:p>
+      <w:r>
+        <w:t>Riferimento — top-5 transizioni della versione originale (L_MAX=4, DELTA=86400s):</w:t>
+      </w:r>
+    </w:p>
+    <w:tbl>
+      <w:tblPr>
+        <w:tblW w:type="auto" w:w="0"/>
+        <w:tblLook w:firstColumn="1" w:firstRow="1" w:lastColumn="0" w:lastRow="0" w:noHBand="0" w:noVBand="1" w:val="04A0"/>
+      </w:tblPr>
+      <w:tblGrid>
+        <w:gridCol w:w="2256"/>
+        <w:gridCol w:w="2256"/>
+        <w:gridCol w:w="2256"/>
+        <w:gridCol w:w="2256"/>
+      </w:tblGrid>
+      <w:tr>
+        <w:tc>
+          <w:tcPr>
+            <w:tcW w:type="dxa" w:w="2256"/>
+          </w:tcPr>
+          <w:p>
+            <w:r>
+              <w:rPr>
+                <w:b/>
+              </w:rPr>
+              <w:t>Prefisso</w:t>
+            </w:r>
+          </w:p>
+        </w:tc>
+        <w:tc>
+          <w:tcPr>
+            <w:tcW w:type="dxa" w:w="2256"/>
+          </w:tcPr>
+          <w:p>
+            <w:r>
+              <w:rPr>
+                <w:b/>
+              </w:rPr>
+              <w:t>Terzo evento</w:t>
+            </w:r>
+          </w:p>
+        </w:tc>
+        <w:tc>
+          <w:tcPr>
+            <w:tcW w:type="dxa" w:w="2256"/>
+          </w:tcPr>
+          <w:p>
+            <w:r>
+              <w:rPr>
+                <w:b/>
+              </w:rPr>
+              <w:t>Probabilità</w:t>
+            </w:r>
+          </w:p>
+        </w:tc>
+        <w:tc>
+          <w:tcPr>
+            <w:tcW w:type="dxa" w:w="2256"/>
+          </w:tcPr>
+          <w:p>
+            <w:r>
+              <w:rPr>
+                <w:b/>
+              </w:rPr>
+              <w:t>Count</w:t>
+            </w:r>
+          </w:p>
+        </w:tc>
+      </w:tr>
+      <w:tr>
+        <w:tc>
+          <w:tcPr>
+            <w:tcW w:type="dxa" w:w="2256"/>
+          </w:tcPr>
+          <w:p>
+            <w:r>
+              <w:t>0102</w:t>
+            </w:r>
+          </w:p>
+        </w:tc>
+        <w:tc>
+          <w:tcPr>
+            <w:tcW w:type="dxa" w:w="2256"/>
+          </w:tcPr>
+          <w:p>
+            <w:r>
+              <w:t>03</w:t>
+            </w:r>
+          </w:p>
+        </w:tc>
+        <w:tc>
+          <w:tcPr>
+            <w:tcW w:type="dxa" w:w="2256"/>
+          </w:tcPr>
+          <w:p>
+            <w:r>
+              <w:t>0.4066</w:t>
+            </w:r>
+          </w:p>
+        </w:tc>
+        <w:tc>
+          <w:tcPr>
+            <w:tcW w:type="dxa" w:w="2256"/>
+          </w:tcPr>
+          <w:p>
+            <w:r>
+              <w:t>196</w:t>
+            </w:r>
+          </w:p>
+        </w:tc>
+      </w:tr>
+      <w:tr>
+        <w:tc>
+          <w:tcPr>
+            <w:tcW w:type="dxa" w:w="2256"/>
+          </w:tcPr>
+          <w:p>
+            <w:r>
+              <w:t>0101</w:t>
+            </w:r>
+          </w:p>
+        </w:tc>
+        <w:tc>
+          <w:tcPr>
+            <w:tcW w:type="dxa" w:w="2256"/>
+          </w:tcPr>
+          <w:p>
+            <w:r>
+              <w:t>01</w:t>
+            </w:r>
+          </w:p>
+        </w:tc>
+        <w:tc>
+          <w:tcPr>
+            <w:tcW w:type="dxa" w:w="2256"/>
+          </w:tcPr>
+          <w:p>
+            <w:r>
+              <w:t>0.3894</w:t>
+            </w:r>
+          </w:p>
+        </w:tc>
+        <w:tc>
+          <w:tcPr>
+            <w:tcW w:type="dxa" w:w="2256"/>
+          </w:tcPr>
+          <w:p>
+            <w:r>
+              <w:t>81</w:t>
+            </w:r>
+          </w:p>
+        </w:tc>
+      </w:tr>
+      <w:tr>
+        <w:tc>
+          <w:tcPr>
+            <w:tcW w:type="dxa" w:w="2256"/>
+          </w:tcPr>
+          <w:p>
+            <w:r>
+              <w:t>0110</w:t>
+            </w:r>
+          </w:p>
+        </w:tc>
+        <w:tc>
+          <w:tcPr>
+            <w:tcW w:type="dxa" w:w="2256"/>
+          </w:tcPr>
+          <w:p>
+            <w:r>
+              <w:t>01</w:t>
+            </w:r>
+          </w:p>
+        </w:tc>
+        <w:tc>
+          <w:tcPr>
+            <w:tcW w:type="dxa" w:w="2256"/>
+          </w:tcPr>
+          <w:p>
+            <w:r>
+              <w:t>0.3669</w:t>
+            </w:r>
+          </w:p>
+        </w:tc>
+        <w:tc>
+          <w:tcPr>
+            <w:tcW w:type="dxa" w:w="2256"/>
+          </w:tcPr>
+          <w:p>
+            <w:r>
+              <w:t>51</w:t>
+            </w:r>
+          </w:p>
+        </w:tc>
+      </w:tr>
+      <w:tr>
+        <w:tc>
+          <w:tcPr>
+            <w:tcW w:type="dxa" w:w="2256"/>
+          </w:tcPr>
+          <w:p>
+            <w:r>
+              <w:t>0120</w:t>
+            </w:r>
+          </w:p>
+        </w:tc>
+        <w:tc>
+          <w:tcPr>
+            <w:tcW w:type="dxa" w:w="2256"/>
+          </w:tcPr>
+          <w:p>
+            <w:r>
+              <w:t>23</w:t>
+            </w:r>
+          </w:p>
+        </w:tc>
+        <w:tc>
+          <w:tcPr>
+            <w:tcW w:type="dxa" w:w="2256"/>
+          </w:tcPr>
+          <w:p>
+            <w:r>
+              <w:t>0.3152</w:t>
+            </w:r>
+          </w:p>
+        </w:tc>
+        <w:tc>
+          <w:tcPr>
+            <w:tcW w:type="dxa" w:w="2256"/>
+          </w:tcPr>
+          <w:p>
+            <w:r>
+              <w:t>58</w:t>
+            </w:r>
+          </w:p>
+        </w:tc>
+      </w:tr>
+      <w:tr>
+        <w:tc>
+          <w:tcPr>
+            <w:tcW w:type="dxa" w:w="2256"/>
+          </w:tcPr>
+          <w:p>
+            <w:r>
+              <w:t>0121</w:t>
+            </w:r>
+          </w:p>
+        </w:tc>
+        <w:tc>
+          <w:tcPr>
+            <w:tcW w:type="dxa" w:w="2256"/>
+          </w:tcPr>
+          <w:p>
+            <w:r>
+              <w:t>23</w:t>
+            </w:r>
+          </w:p>
+        </w:tc>
+        <w:tc>
+          <w:tcPr>
+            <w:tcW w:type="dxa" w:w="2256"/>
+          </w:tcPr>
+          <w:p>
+            <w:r>
+              <w:t>0.2872</w:t>
+            </w:r>
+          </w:p>
+        </w:tc>
+        <w:tc>
+          <w:tcPr>
+            <w:tcW w:type="dxa" w:w="2256"/>
+          </w:tcPr>
+          <w:p>
+            <w:r>
+              <w:t>85</w:t>
+            </w:r>
+          </w:p>
+        </w:tc>
+      </w:tr>
+    </w:tbl>
+    <w:p>
+      <w:pPr>
+        <w:jc w:val="center"/>
+      </w:pPr>
+      <w:r>
+        <w:drawing>
+          <wp:inline xmlns:a="http://schemas.openxmlformats.org/drawingml/2006/main" xmlns:pic="http://schemas.openxmlformats.org/drawingml/2006/picture">
+            <wp:extent cx="5038344" cy="2835266"/>
+            <wp:docPr id="2" name="Picture 2"/>
+            <wp:cNvGraphicFramePr>
+              <a:graphicFrameLocks noChangeAspect="1"/>
+            </wp:cNvGraphicFramePr>
+            <a:graphic>
+              <a:graphicData uri="http://schemas.openxmlformats.org/drawingml/2006/picture">
+                <pic:pic>
+                  <pic:nvPicPr>
+                    <pic:cNvPr id="0" name="image.png"/>
+                    <pic:cNvPicPr/>
+                  </pic:nvPicPr>
+                  <pic:blipFill>
+                    <a:blip r:embed="rId7"/>
+                    <a:stretch>
+                      <a:fillRect/>
+                    </a:stretch>
+                  </pic:blipFill>
+                  <pic:spPr>
+                    <a:xfrm>
+                      <a:off x="0" y="0"/>
+                      <a:ext cx="5038344" cy="2835266"/>
+                    </a:xfrm>
+                    <a:prstGeom prst="rect"/>
+                  </pic:spPr>
+                </pic:pic>
+              </a:graphicData>
+            </a:graphic>
+          </wp:inline>
+        </w:drawing>
       </w:r>
     </w:p>
     <w:p>
@@ -1921,11 +2302,7 @@
         <w:spacing w:after="150"/>
       </w:pPr>
       <w:r>
-        <w:rPr>
-          <w:b/>
-          <w:bCs/>
-        </w:rPr>
-        <w:t xml:space="preserve">Granularità raccomandata: 1 ora (3600s).</w:t>
+        <w:t>Granularità candidate per EvoMine: 30 minuti (1800s) e 1 ora (3600s) — entrambe verranno testate in parallelo.</w:t>
       </w:r>
     </w:p>
     <w:p>
@@ -1933,7 +2310,7 @@
         <w:spacing w:after="150"/>
       </w:pPr>
       <w:r>
-        <w:t xml:space="preserve">Motivazione: cattura il 99.4% degli IET entro 1 bucket, produce 374 bucket totali — bilanciamento ottimale tra precisione temporale e sostenibilità computazionale per EvoMine.</w:t>
+        <w:t>Motivazione: la mediana degli IET (47s) suggerisce una granularità sub-oraria; sia 30 minuti (98.6% IET entro 1 bucket, 747 bucket totali) sia 1 ora (99.4% IET entro 1 bucket, 374 bucket totali) sono candidate valide. Per non anticipare una scelta che spetta alla correlatrice, il preprocessing GER, la run EvoMine, la transition matrix MTM (Sezione 3) e il confronto MTM↔EvoMine (Task 4) vengono prodotti per entrambe le granularità: la selezione finale sarà concordata nella prossima call.</w:t>
       </w:r>
     </w:p>
     <w:p>
@@ -1942,72 +2319,23 @@
         <w:spacing w:after="150" w:before="300"/>
       </w:pPr>
       <w:r>
-        <w:t xml:space="preserve">5. Prossimi passi</w:t>
-      </w:r>
-    </w:p>
-    <w:p>
-      <w:pPr>
-        <w:pStyle w:val="ListParagraph"/>
-        <w:numPr>
-          <w:ilvl w:val="0"/>
-          <w:numId w:val="1"/>
-        </w:numPr>
+        <w:t>5. Stato e prossimi passi</w:t>
+      </w:r>
+    </w:p>
+    <w:p>
+      <w:pPr>
         <w:spacing w:after="80"/>
       </w:pPr>
       <w:r>
-        <w:t xml:space="preserve">Confermare granularità con correlatrice</w:t>
-      </w:r>
-    </w:p>
-    <w:p>
-      <w:pPr>
-        <w:pStyle w:val="ListParagraph"/>
-        <w:numPr>
-          <w:ilvl w:val="0"/>
-          <w:numId w:val="1"/>
-        </w:numPr>
+        <w:t>I passi originalmente previsti (run EvoMine con support=1, codifica canonica dei pattern, confronto diretto con la transition matrix MTM) sono stati completati nel Task 4.</w:t>
+      </w:r>
+    </w:p>
+    <w:p>
+      <w:pPr>
         <w:spacing w:after="80"/>
       </w:pPr>
       <w:r>
-        <w:t xml:space="preserve">Preprocessing con bucket orari</w:t>
-      </w:r>
-    </w:p>
-    <w:p>
-      <w:pPr>
-        <w:pStyle w:val="ListParagraph"/>
-        <w:numPr>
-          <w:ilvl w:val="0"/>
-          <w:numId w:val="1"/>
-        </w:numPr>
-        <w:spacing w:after="80"/>
-      </w:pPr>
-      <w:r>
-        <w:t xml:space="preserve">Run EvoMine con projection=event, support=1</w:t>
-      </w:r>
-    </w:p>
-    <w:p>
-      <w:pPr>
-        <w:pStyle w:val="ListParagraph"/>
-        <w:numPr>
-          <w:ilvl w:val="0"/>
-          <w:numId w:val="1"/>
-        </w:numPr>
-        <w:spacing w:after="80"/>
-      </w:pPr>
-      <w:r>
-        <w:t xml:space="preserve">Codifica pattern EvoMine con stessa codifica MTM</w:t>
-      </w:r>
-    </w:p>
-    <w:p>
-      <w:pPr>
-        <w:pStyle w:val="ListParagraph"/>
-        <w:numPr>
-          <w:ilvl w:val="0"/>
-          <w:numId w:val="1"/>
-        </w:numPr>
-        <w:spacing w:after="80"/>
-      </w:pPr>
-      <w:r>
-        <w:t xml:space="preserve">Confronto diretto transition matrix vs profilo GER</w:t>
+        <w:t>Unico punto ancora aperto: confermare con la correlatrice la scelta definitiva tra granularità 30 minuti (1800s) e 1 ora (3600s). I risultati qualitativi sono identici in entrambi i casi — cambia solo il tempo di esecuzione di EvoMine (197s vs 97s) e la scala assoluta dei supporti.</w:t>
       </w:r>
     </w:p>
     <w:sectPr>

</xml_diff>